<commit_message>
Apply Craig review edits to project docs
</commit_message>
<xml_diff>
--- a/data/raw/physio_morphology/SCORING_NOTES.docx
+++ b/data/raw/physio_morphology/SCORING_NOTES.docx
@@ -63,69 +63,59 @@
         <w:rPr>
           <w:rFonts w:ascii="Calibri" w:hAnsi="Calibri" w:cs="Calibri" w:eastAsia="Calibri"/>
         </w:rPr>
-        <w:t xml:space="preserve">Where the binary wound-healing trait columns in</w:t>
-      </w:r>
-      <w:r>
-        <w:rPr>
-          <w:rFonts w:ascii="Calibri" w:hAnsi="Calibri" w:cs="Calibri" w:eastAsia="Calibri"/>
-        </w:rPr>
-        <w:t xml:space="preserve"> </w:t>
+        <w:t>Where the yes/no wound-recovery score columns in data.csv / physio_characterization_log_-_complete.xlsx come from, plus a known issue where two columns record the same trait. Compiled from the lab's records:</w:t>
+      </w:r>
+      <w:r>
+        <w:rPr>
+          <w:rFonts w:ascii="Calibri" w:hAnsi="Calibri" w:cs="Calibri" w:eastAsia="Calibri"/>
+        </w:rPr>
       </w:r>
       <w:r>
         <w:rPr>
           <w:rFonts w:ascii="Calibri" w:hAnsi="Calibri" w:cs="Calibri" w:eastAsia="Calibri"/>
           <w:rStyle w:val="VerbatimChar"/>
         </w:rPr>
-        <w:t xml:space="preserve">data.csv</w:t>
-      </w:r>
-      <w:r>
-        <w:rPr>
-          <w:rFonts w:ascii="Calibri" w:hAnsi="Calibri" w:cs="Calibri" w:eastAsia="Calibri"/>
-        </w:rPr>
-        <w:t xml:space="preserve"> </w:t>
-      </w:r>
-      <w:r>
-        <w:rPr>
-          <w:rFonts w:ascii="Calibri" w:hAnsi="Calibri" w:cs="Calibri" w:eastAsia="Calibri"/>
-        </w:rPr>
-        <w:t xml:space="preserve">/</w:t>
-      </w:r>
-      <w:r>
-        <w:rPr>
-          <w:rFonts w:ascii="Calibri" w:hAnsi="Calibri" w:cs="Calibri" w:eastAsia="Calibri"/>
-        </w:rPr>
-        <w:t xml:space="preserve"> </w:t>
+      </w:r>
+      <w:r>
+        <w:rPr>
+          <w:rFonts w:ascii="Calibri" w:hAnsi="Calibri" w:cs="Calibri" w:eastAsia="Calibri"/>
+        </w:rPr>
+      </w:r>
+      <w:r>
+        <w:rPr>
+          <w:rFonts w:ascii="Calibri" w:hAnsi="Calibri" w:cs="Calibri" w:eastAsia="Calibri"/>
+        </w:rPr>
+      </w:r>
+      <w:r>
+        <w:rPr>
+          <w:rFonts w:ascii="Calibri" w:hAnsi="Calibri" w:cs="Calibri" w:eastAsia="Calibri"/>
+        </w:rPr>
       </w:r>
       <w:r>
         <w:rPr>
           <w:rFonts w:ascii="Calibri" w:hAnsi="Calibri" w:cs="Calibri" w:eastAsia="Calibri"/>
           <w:rStyle w:val="VerbatimChar"/>
         </w:rPr>
-        <w:t xml:space="preserve">physio_characterization_log_-_complete.xlsx</w:t>
-      </w:r>
-      <w:r>
-        <w:rPr>
-          <w:rFonts w:ascii="Calibri" w:hAnsi="Calibri" w:cs="Calibri" w:eastAsia="Calibri"/>
-        </w:rPr>
-        <w:t xml:space="preserve"> </w:t>
-      </w:r>
-      <w:r>
-        <w:rPr>
-          <w:rFonts w:ascii="Calibri" w:hAnsi="Calibri" w:cs="Calibri" w:eastAsia="Calibri"/>
-        </w:rPr>
-        <w:t xml:space="preserve">come from, plus a known data-quality</w:t>
-      </w:r>
-      <w:r>
-        <w:rPr>
-          <w:rFonts w:ascii="Calibri" w:hAnsi="Calibri" w:cs="Calibri" w:eastAsia="Calibri"/>
-        </w:rPr>
-        <w:t xml:space="preserve"> </w:t>
-      </w:r>
-      <w:r>
-        <w:rPr>
-          <w:rFonts w:ascii="Calibri" w:hAnsi="Calibri" w:cs="Calibri" w:eastAsia="Calibri"/>
-        </w:rPr>
-        <w:t xml:space="preserve">issue. Compiled from the lab's records:</w:t>
+      </w:r>
+      <w:r>
+        <w:rPr>
+          <w:rFonts w:ascii="Calibri" w:hAnsi="Calibri" w:cs="Calibri" w:eastAsia="Calibri"/>
+        </w:rPr>
+      </w:r>
+      <w:r>
+        <w:rPr>
+          <w:rFonts w:ascii="Calibri" w:hAnsi="Calibri" w:cs="Calibri" w:eastAsia="Calibri"/>
+        </w:rPr>
+      </w:r>
+      <w:r>
+        <w:rPr>
+          <w:rFonts w:ascii="Calibri" w:hAnsi="Calibri" w:cs="Calibri" w:eastAsia="Calibri"/>
+        </w:rPr>
+      </w:r>
+      <w:r>
+        <w:rPr>
+          <w:rFonts w:ascii="Calibri" w:hAnsi="Calibri" w:cs="Calibri" w:eastAsia="Calibri"/>
+        </w:rPr>
       </w:r>
     </w:p>
     <w:p>
@@ -489,6 +479,14 @@
         <w:t xml:space="preserve">apply to these traits.</w:t>
       </w:r>
     </w:p>
+    <w:p>
+      <w:pPr>
+        <w:pStyle w:val="BlockText"/>
+      </w:pPr>
+      <w:r>
+        <w:t>Scoring details still to add before manuscript use: number of scorers, whether scoring was blind to treatment, and whether any re-scoring or reliability check was done.</w:t>
+      </w:r>
+    </w:p>
     <w:bookmarkStart w:id="9" w:name="X12e2404422956101bd03c4ccc5fc33c9d6971d5"/>
     <w:p>
       <w:pPr>
@@ -547,76 +545,65 @@
         <w:rPr>
           <w:rFonts w:ascii="Calibri" w:hAnsi="Calibri" w:cs="Calibri" w:eastAsia="Calibri"/>
         </w:rPr>
-        <w:t xml:space="preserve">All traits are scored</w:t>
-      </w:r>
-      <w:r>
-        <w:rPr>
-          <w:rFonts w:ascii="Calibri" w:hAnsi="Calibri" w:cs="Calibri" w:eastAsia="Calibri"/>
-        </w:rPr>
-        <w:t xml:space="preserve"> </w:t>
+        <w:t>All traits are scored yes/no by eye from the daily color-card photo. Verify whether microscope photos were also used for scoring before writing final methods. Blank/NA = not scored that visit; if possible, distinguish not visible, missing, dead, and absent.</w:t>
+      </w:r>
+      <w:r>
+        <w:rPr>
+          <w:rFonts w:ascii="Calibri" w:hAnsi="Calibri" w:cs="Calibri" w:eastAsia="Calibri"/>
+        </w:rPr>
       </w:r>
       <w:r>
         <w:rPr>
           <w:rFonts w:ascii="Calibri" w:hAnsi="Calibri" w:cs="Calibri" w:eastAsia="Calibri"/>
           <w:rStyle w:val="VerbatimChar"/>
         </w:rPr>
-        <w:t xml:space="preserve">yes</w:t>
-      </w:r>
-      <w:r>
-        <w:rPr>
-          <w:rFonts w:ascii="Calibri" w:hAnsi="Calibri" w:cs="Calibri" w:eastAsia="Calibri"/>
-        </w:rPr>
-        <w:t xml:space="preserve">/</w:t>
+      </w:r>
+      <w:r>
+        <w:rPr>
+          <w:rFonts w:ascii="Calibri" w:hAnsi="Calibri" w:cs="Calibri" w:eastAsia="Calibri"/>
+        </w:rPr>
       </w:r>
       <w:r>
         <w:rPr>
           <w:rFonts w:ascii="Calibri" w:hAnsi="Calibri" w:cs="Calibri" w:eastAsia="Calibri"/>
           <w:rStyle w:val="VerbatimChar"/>
         </w:rPr>
-        <w:t xml:space="preserve">no</w:t>
-      </w:r>
-      <w:r>
-        <w:rPr>
-          <w:rFonts w:ascii="Calibri" w:hAnsi="Calibri" w:cs="Calibri" w:eastAsia="Calibri"/>
-        </w:rPr>
-        <w:t xml:space="preserve"> </w:t>
-      </w:r>
-      <w:r>
-        <w:rPr>
-          <w:rFonts w:ascii="Calibri" w:hAnsi="Calibri" w:cs="Calibri" w:eastAsia="Calibri"/>
-        </w:rPr>
-        <w:t xml:space="preserve">by eye from the daily color-card photo.</w:t>
-      </w:r>
-      <w:r>
-        <w:rPr>
-          <w:rFonts w:ascii="Calibri" w:hAnsi="Calibri" w:cs="Calibri" w:eastAsia="Calibri"/>
-        </w:rPr>
-        <w:t xml:space="preserve"> </w:t>
-      </w:r>
-      <w:r>
-        <w:rPr>
-          <w:rFonts w:ascii="Calibri" w:hAnsi="Calibri" w:cs="Calibri" w:eastAsia="Calibri"/>
-        </w:rPr>
-        <w:t xml:space="preserve">Blank/</w:t>
+      </w:r>
+      <w:r>
+        <w:rPr>
+          <w:rFonts w:ascii="Calibri" w:hAnsi="Calibri" w:cs="Calibri" w:eastAsia="Calibri"/>
+        </w:rPr>
+      </w:r>
+      <w:r>
+        <w:rPr>
+          <w:rFonts w:ascii="Calibri" w:hAnsi="Calibri" w:cs="Calibri" w:eastAsia="Calibri"/>
+        </w:rPr>
+      </w:r>
+      <w:r>
+        <w:rPr>
+          <w:rFonts w:ascii="Calibri" w:hAnsi="Calibri" w:cs="Calibri" w:eastAsia="Calibri"/>
+        </w:rPr>
+      </w:r>
+      <w:r>
+        <w:rPr>
+          <w:rFonts w:ascii="Calibri" w:hAnsi="Calibri" w:cs="Calibri" w:eastAsia="Calibri"/>
+        </w:rPr>
       </w:r>
       <w:r>
         <w:rPr>
           <w:rFonts w:ascii="Calibri" w:hAnsi="Calibri" w:cs="Calibri" w:eastAsia="Calibri"/>
           <w:rStyle w:val="VerbatimChar"/>
         </w:rPr>
-        <w:t xml:space="preserve">NA</w:t>
-      </w:r>
-      <w:r>
-        <w:rPr>
-          <w:rFonts w:ascii="Calibri" w:hAnsi="Calibri" w:cs="Calibri" w:eastAsia="Calibri"/>
-        </w:rPr>
-        <w:t xml:space="preserve"> </w:t>
-      </w:r>
-      <w:r>
-        <w:rPr>
-          <w:rFonts w:ascii="Calibri" w:hAnsi="Calibri" w:cs="Calibri" w:eastAsia="Calibri"/>
-        </w:rPr>
-        <w:t xml:space="preserve">= not scored that visit.</w:t>
+      </w:r>
+      <w:r>
+        <w:rPr>
+          <w:rFonts w:ascii="Calibri" w:hAnsi="Calibri" w:cs="Calibri" w:eastAsia="Calibri"/>
+        </w:rPr>
+      </w:r>
+      <w:r>
+        <w:rPr>
+          <w:rFonts w:ascii="Calibri" w:hAnsi="Calibri" w:cs="Calibri" w:eastAsia="Calibri"/>
+        </w:rPr>
       </w:r>
     </w:p>
     <w:tbl>
@@ -1210,151 +1197,128 @@
         <w:rPr>
           <w:rFonts w:ascii="Calibri" w:hAnsi="Calibri" w:cs="Calibri" w:eastAsia="Calibri"/>
         </w:rPr>
-        <w:t xml:space="preserve">Design columns:</w:t>
-      </w:r>
-      <w:r>
-        <w:rPr>
-          <w:rFonts w:ascii="Calibri" w:hAnsi="Calibri" w:cs="Calibri" w:eastAsia="Calibri"/>
-        </w:rPr>
-        <w:t xml:space="preserve"> </w:t>
+        <w:t>Design columns: day (post-wound day, D0 = wounding), treatment (28/31 °C), tank, thicket (field thicket/genet proxy; pre-genotyping alphabetical label), id (coral), wounded (yes = wounded, no = control).</w:t>
+      </w:r>
+      <w:r>
+        <w:rPr>
+          <w:rFonts w:ascii="Calibri" w:hAnsi="Calibri" w:cs="Calibri" w:eastAsia="Calibri"/>
+        </w:rPr>
       </w:r>
       <w:r>
         <w:rPr>
           <w:rFonts w:ascii="Calibri" w:hAnsi="Calibri" w:cs="Calibri" w:eastAsia="Calibri"/>
           <w:rStyle w:val="VerbatimChar"/>
         </w:rPr>
-        <w:t xml:space="preserve">day</w:t>
-      </w:r>
-      <w:r>
-        <w:rPr>
-          <w:rFonts w:ascii="Calibri" w:hAnsi="Calibri" w:cs="Calibri" w:eastAsia="Calibri"/>
-        </w:rPr>
-        <w:t xml:space="preserve"> </w:t>
-      </w:r>
-      <w:r>
-        <w:rPr>
-          <w:rFonts w:ascii="Calibri" w:hAnsi="Calibri" w:cs="Calibri" w:eastAsia="Calibri"/>
-        </w:rPr>
-        <w:t xml:space="preserve">(post-wound day, D0 = wounding),</w:t>
-      </w:r>
-      <w:r>
-        <w:rPr>
-          <w:rFonts w:ascii="Calibri" w:hAnsi="Calibri" w:cs="Calibri" w:eastAsia="Calibri"/>
-        </w:rPr>
-        <w:t xml:space="preserve"> </w:t>
+      </w:r>
+      <w:r>
+        <w:rPr>
+          <w:rFonts w:ascii="Calibri" w:hAnsi="Calibri" w:cs="Calibri" w:eastAsia="Calibri"/>
+        </w:rPr>
+      </w:r>
+      <w:r>
+        <w:rPr>
+          <w:rFonts w:ascii="Calibri" w:hAnsi="Calibri" w:cs="Calibri" w:eastAsia="Calibri"/>
+        </w:rPr>
+      </w:r>
+      <w:r>
+        <w:rPr>
+          <w:rFonts w:ascii="Calibri" w:hAnsi="Calibri" w:cs="Calibri" w:eastAsia="Calibri"/>
+        </w:rPr>
       </w:r>
       <w:r>
         <w:rPr>
           <w:rFonts w:ascii="Calibri" w:hAnsi="Calibri" w:cs="Calibri" w:eastAsia="Calibri"/>
           <w:rStyle w:val="VerbatimChar"/>
         </w:rPr>
-        <w:t xml:space="preserve">treatment</w:t>
-      </w:r>
-      <w:r>
-        <w:rPr>
-          <w:rFonts w:ascii="Calibri" w:hAnsi="Calibri" w:cs="Calibri" w:eastAsia="Calibri"/>
-        </w:rPr>
-        <w:t xml:space="preserve"> </w:t>
-      </w:r>
-      <w:r>
-        <w:rPr>
-          <w:rFonts w:ascii="Calibri" w:hAnsi="Calibri" w:cs="Calibri" w:eastAsia="Calibri"/>
-        </w:rPr>
-        <w:t xml:space="preserve">(28/31 °C),</w:t>
-      </w:r>
-      <w:r>
-        <w:rPr>
-          <w:rFonts w:ascii="Calibri" w:hAnsi="Calibri" w:cs="Calibri" w:eastAsia="Calibri"/>
-        </w:rPr>
-        <w:t xml:space="preserve"> </w:t>
+      </w:r>
+      <w:r>
+        <w:rPr>
+          <w:rFonts w:ascii="Calibri" w:hAnsi="Calibri" w:cs="Calibri" w:eastAsia="Calibri"/>
+        </w:rPr>
+      </w:r>
+      <w:r>
+        <w:rPr>
+          <w:rFonts w:ascii="Calibri" w:hAnsi="Calibri" w:cs="Calibri" w:eastAsia="Calibri"/>
+        </w:rPr>
+      </w:r>
+      <w:r>
+        <w:rPr>
+          <w:rFonts w:ascii="Calibri" w:hAnsi="Calibri" w:cs="Calibri" w:eastAsia="Calibri"/>
+        </w:rPr>
       </w:r>
       <w:r>
         <w:rPr>
           <w:rFonts w:ascii="Calibri" w:hAnsi="Calibri" w:cs="Calibri" w:eastAsia="Calibri"/>
           <w:rStyle w:val="VerbatimChar"/>
         </w:rPr>
-        <w:t xml:space="preserve">tank</w:t>
-      </w:r>
-      <w:r>
-        <w:rPr>
-          <w:rFonts w:ascii="Calibri" w:hAnsi="Calibri" w:cs="Calibri" w:eastAsia="Calibri"/>
-        </w:rPr>
-        <w:t xml:space="preserve">,</w:t>
-      </w:r>
-      <w:r>
-        <w:rPr>
-          <w:rFonts w:ascii="Calibri" w:hAnsi="Calibri" w:cs="Calibri" w:eastAsia="Calibri"/>
-        </w:rPr>
-        <w:t xml:space="preserve"> </w:t>
+      </w:r>
+      <w:r>
+        <w:rPr>
+          <w:rFonts w:ascii="Calibri" w:hAnsi="Calibri" w:cs="Calibri" w:eastAsia="Calibri"/>
+        </w:rPr>
+      </w:r>
+      <w:r>
+        <w:rPr>
+          <w:rFonts w:ascii="Calibri" w:hAnsi="Calibri" w:cs="Calibri" w:eastAsia="Calibri"/>
+        </w:rPr>
       </w:r>
       <w:r>
         <w:rPr>
           <w:rFonts w:ascii="Calibri" w:hAnsi="Calibri" w:cs="Calibri" w:eastAsia="Calibri"/>
           <w:rStyle w:val="VerbatimChar"/>
         </w:rPr>
-        <w:t xml:space="preserve">thicket</w:t>
-      </w:r>
-      <w:r>
-        <w:rPr>
-          <w:rFonts w:ascii="Calibri" w:hAnsi="Calibri" w:cs="Calibri" w:eastAsia="Calibri"/>
-        </w:rPr>
-        <w:t xml:space="preserve"> </w:t>
-      </w:r>
-      <w:r>
-        <w:rPr>
-          <w:rFonts w:ascii="Calibri" w:hAnsi="Calibri" w:cs="Calibri" w:eastAsia="Calibri"/>
-        </w:rPr>
-        <w:t xml:space="preserve">(genet, pre-genotype alphabetical label),</w:t>
-      </w:r>
-      <w:r>
-        <w:rPr>
-          <w:rFonts w:ascii="Calibri" w:hAnsi="Calibri" w:cs="Calibri" w:eastAsia="Calibri"/>
-        </w:rPr>
-        <w:t xml:space="preserve"> </w:t>
+      </w:r>
+      <w:r>
+        <w:rPr>
+          <w:rFonts w:ascii="Calibri" w:hAnsi="Calibri" w:cs="Calibri" w:eastAsia="Calibri"/>
+        </w:rPr>
+      </w:r>
+      <w:r>
+        <w:rPr>
+          <w:rFonts w:ascii="Calibri" w:hAnsi="Calibri" w:cs="Calibri" w:eastAsia="Calibri"/>
+        </w:rPr>
+      </w:r>
+      <w:r>
+        <w:rPr>
+          <w:rFonts w:ascii="Calibri" w:hAnsi="Calibri" w:cs="Calibri" w:eastAsia="Calibri"/>
+        </w:rPr>
       </w:r>
       <w:r>
         <w:rPr>
           <w:rFonts w:ascii="Calibri" w:hAnsi="Calibri" w:cs="Calibri" w:eastAsia="Calibri"/>
           <w:rStyle w:val="VerbatimChar"/>
         </w:rPr>
-        <w:t xml:space="preserve">id</w:t>
-      </w:r>
-      <w:r>
-        <w:rPr>
-          <w:rFonts w:ascii="Calibri" w:hAnsi="Calibri" w:cs="Calibri" w:eastAsia="Calibri"/>
-        </w:rPr>
-        <w:t xml:space="preserve"> </w:t>
-      </w:r>
-      <w:r>
-        <w:rPr>
-          <w:rFonts w:ascii="Calibri" w:hAnsi="Calibri" w:cs="Calibri" w:eastAsia="Calibri"/>
-        </w:rPr>
-        <w:t xml:space="preserve">(coral),</w:t>
-      </w:r>
-      <w:r>
-        <w:rPr>
-          <w:rFonts w:ascii="Calibri" w:hAnsi="Calibri" w:cs="Calibri" w:eastAsia="Calibri"/>
-        </w:rPr>
-        <w:t xml:space="preserve"> </w:t>
+      </w:r>
+      <w:r>
+        <w:rPr>
+          <w:rFonts w:ascii="Calibri" w:hAnsi="Calibri" w:cs="Calibri" w:eastAsia="Calibri"/>
+        </w:rPr>
+      </w:r>
+      <w:r>
+        <w:rPr>
+          <w:rFonts w:ascii="Calibri" w:hAnsi="Calibri" w:cs="Calibri" w:eastAsia="Calibri"/>
+        </w:rPr>
+      </w:r>
+      <w:r>
+        <w:rPr>
+          <w:rFonts w:ascii="Calibri" w:hAnsi="Calibri" w:cs="Calibri" w:eastAsia="Calibri"/>
+        </w:rPr>
       </w:r>
       <w:r>
         <w:rPr>
           <w:rFonts w:ascii="Calibri" w:hAnsi="Calibri" w:cs="Calibri" w:eastAsia="Calibri"/>
           <w:rStyle w:val="VerbatimChar"/>
         </w:rPr>
-        <w:t xml:space="preserve">wounded</w:t>
-      </w:r>
-      <w:r>
-        <w:rPr>
-          <w:rFonts w:ascii="Calibri" w:hAnsi="Calibri" w:cs="Calibri" w:eastAsia="Calibri"/>
-        </w:rPr>
-        <w:t xml:space="preserve"> </w:t>
-      </w:r>
-      <w:r>
-        <w:rPr>
-          <w:rFonts w:ascii="Calibri" w:hAnsi="Calibri" w:cs="Calibri" w:eastAsia="Calibri"/>
-        </w:rPr>
-        <w:t xml:space="preserve">(yes = wounded, no = control).</w:t>
+      </w:r>
+      <w:r>
+        <w:rPr>
+          <w:rFonts w:ascii="Calibri" w:hAnsi="Calibri" w:cs="Calibri" w:eastAsia="Calibri"/>
+        </w:rPr>
+      </w:r>
+      <w:r>
+        <w:rPr>
+          <w:rFonts w:ascii="Calibri" w:hAnsi="Calibri" w:cs="Calibri" w:eastAsia="Calibri"/>
+        </w:rPr>
       </w:r>
     </w:p>
     <w:bookmarkEnd w:id="9"/>
@@ -1371,7 +1335,7 @@
           <w:color w:val="2E5496"/>
           <w:b/>
         </w:rPr>
-        <w:t xml:space="preserve">Healing timeline (unheated corals; from the field-notes doc)</w:t>
+        <w:t>Healing timeline (28 C corals; from the field-notes doc)</w:t>
       </w:r>
     </w:p>
     <w:p>
@@ -2111,63 +2075,54 @@
         <w:rPr>
           <w:rFonts w:ascii="Calibri" w:hAnsi="Calibri" w:cs="Calibri" w:eastAsia="Calibri"/>
         </w:rPr>
-        <w:t xml:space="preserve">In both</w:t>
-      </w:r>
-      <w:r>
-        <w:rPr>
-          <w:rFonts w:ascii="Calibri" w:hAnsi="Calibri" w:cs="Calibri" w:eastAsia="Calibri"/>
-        </w:rPr>
-        <w:t xml:space="preserve"> </w:t>
+        <w:t>In both data.csv and the live master Google Sheet, polyp_in_hole is the same value in every row to hole_in_center — same yes/no/blank/NA in every row (290 yes, 94 no, 384 NA; perfect diagonal cross-tab), switching to yes on the same visit for all 24 wounded corals.</w:t>
+      </w:r>
+      <w:r>
+        <w:rPr>
+          <w:rFonts w:ascii="Calibri" w:hAnsi="Calibri" w:cs="Calibri" w:eastAsia="Calibri"/>
+        </w:rPr>
       </w:r>
       <w:r>
         <w:rPr>
           <w:rFonts w:ascii="Calibri" w:hAnsi="Calibri" w:cs="Calibri" w:eastAsia="Calibri"/>
           <w:rStyle w:val="VerbatimChar"/>
         </w:rPr>
-        <w:t xml:space="preserve">data.csv</w:t>
-      </w:r>
-      <w:r>
-        <w:rPr>
-          <w:rFonts w:ascii="Calibri" w:hAnsi="Calibri" w:cs="Calibri" w:eastAsia="Calibri"/>
-        </w:rPr>
-        <w:t xml:space="preserve"> </w:t>
-      </w:r>
-      <w:r>
-        <w:rPr>
-          <w:rFonts w:ascii="Calibri" w:hAnsi="Calibri" w:cs="Calibri" w:eastAsia="Calibri"/>
-        </w:rPr>
-        <w:t xml:space="preserve">and the live master Google Sheet,</w:t>
-      </w:r>
-      <w:r>
-        <w:rPr>
-          <w:rFonts w:ascii="Calibri" w:hAnsi="Calibri" w:cs="Calibri" w:eastAsia="Calibri"/>
-        </w:rPr>
-        <w:t xml:space="preserve"> </w:t>
+      </w:r>
+      <w:r>
+        <w:rPr>
+          <w:rFonts w:ascii="Calibri" w:hAnsi="Calibri" w:cs="Calibri" w:eastAsia="Calibri"/>
+        </w:rPr>
+      </w:r>
+      <w:r>
+        <w:rPr>
+          <w:rFonts w:ascii="Calibri" w:hAnsi="Calibri" w:cs="Calibri" w:eastAsia="Calibri"/>
+        </w:rPr>
+      </w:r>
+      <w:r>
+        <w:rPr>
+          <w:rFonts w:ascii="Calibri" w:hAnsi="Calibri" w:cs="Calibri" w:eastAsia="Calibri"/>
+        </w:rPr>
       </w:r>
       <w:r>
         <w:rPr>
           <w:rFonts w:ascii="Calibri" w:hAnsi="Calibri" w:cs="Calibri" w:eastAsia="Calibri"/>
           <w:rStyle w:val="VerbatimChar"/>
         </w:rPr>
-        <w:t xml:space="preserve">polyp_in_hole</w:t>
-      </w:r>
-      <w:r>
-        <w:rPr>
-          <w:rFonts w:ascii="Calibri" w:hAnsi="Calibri" w:cs="Calibri" w:eastAsia="Calibri"/>
-        </w:rPr>
-        <w:t xml:space="preserve"> </w:t>
-      </w:r>
-      <w:r>
-        <w:rPr>
-          <w:rFonts w:ascii="Calibri" w:hAnsi="Calibri" w:cs="Calibri" w:eastAsia="Calibri"/>
-        </w:rPr>
-        <w:t xml:space="preserve">is</w:t>
-      </w:r>
-      <w:r>
-        <w:rPr>
-          <w:rFonts w:ascii="Calibri" w:hAnsi="Calibri" w:cs="Calibri" w:eastAsia="Calibri"/>
-        </w:rPr>
-        <w:t xml:space="preserve"> </w:t>
+      </w:r>
+      <w:r>
+        <w:rPr>
+          <w:rFonts w:ascii="Calibri" w:hAnsi="Calibri" w:cs="Calibri" w:eastAsia="Calibri"/>
+        </w:rPr>
+      </w:r>
+      <w:r>
+        <w:rPr>
+          <w:rFonts w:ascii="Calibri" w:hAnsi="Calibri" w:cs="Calibri" w:eastAsia="Calibri"/>
+        </w:rPr>
+      </w:r>
+      <w:r>
+        <w:rPr>
+          <w:rFonts w:ascii="Calibri" w:hAnsi="Calibri" w:cs="Calibri" w:eastAsia="Calibri"/>
+        </w:rPr>
       </w:r>
       <w:r>
         <w:rPr>
@@ -2175,189 +2130,159 @@
           <w:b/>
           <w:bCs/>
         </w:rPr>
-        <w:t xml:space="preserve">byte-for-byte identical</w:t>
-      </w:r>
-      <w:r>
-        <w:rPr>
-          <w:rFonts w:ascii="Calibri" w:hAnsi="Calibri" w:cs="Calibri" w:eastAsia="Calibri"/>
-        </w:rPr>
-        <w:t xml:space="preserve"> </w:t>
-      </w:r>
-      <w:r>
-        <w:rPr>
-          <w:rFonts w:ascii="Calibri" w:hAnsi="Calibri" w:cs="Calibri" w:eastAsia="Calibri"/>
-        </w:rPr>
-        <w:t xml:space="preserve">to</w:t>
-      </w:r>
-      <w:r>
-        <w:rPr>
-          <w:rFonts w:ascii="Calibri" w:hAnsi="Calibri" w:cs="Calibri" w:eastAsia="Calibri"/>
-        </w:rPr>
-        <w:t xml:space="preserve"> </w:t>
+      </w:r>
+      <w:r>
+        <w:rPr>
+          <w:rFonts w:ascii="Calibri" w:hAnsi="Calibri" w:cs="Calibri" w:eastAsia="Calibri"/>
+        </w:rPr>
+      </w:r>
+      <w:r>
+        <w:rPr>
+          <w:rFonts w:ascii="Calibri" w:hAnsi="Calibri" w:cs="Calibri" w:eastAsia="Calibri"/>
+        </w:rPr>
+      </w:r>
+      <w:r>
+        <w:rPr>
+          <w:rFonts w:ascii="Calibri" w:hAnsi="Calibri" w:cs="Calibri" w:eastAsia="Calibri"/>
+        </w:rPr>
       </w:r>
       <w:r>
         <w:rPr>
           <w:rFonts w:ascii="Calibri" w:hAnsi="Calibri" w:cs="Calibri" w:eastAsia="Calibri"/>
           <w:rStyle w:val="VerbatimChar"/>
         </w:rPr>
-        <w:t xml:space="preserve">hole_in_center</w:t>
-      </w:r>
-      <w:r>
-        <w:rPr>
-          <w:rFonts w:ascii="Calibri" w:hAnsi="Calibri" w:cs="Calibri" w:eastAsia="Calibri"/>
-        </w:rPr>
-        <w:t xml:space="preserve"> </w:t>
-      </w:r>
-      <w:r>
-        <w:rPr>
-          <w:rFonts w:ascii="Calibri" w:hAnsi="Calibri" w:cs="Calibri" w:eastAsia="Calibri"/>
-        </w:rPr>
-        <w:t xml:space="preserve">— same</w:t>
-      </w:r>
-      <w:r>
-        <w:rPr>
-          <w:rFonts w:ascii="Calibri" w:hAnsi="Calibri" w:cs="Calibri" w:eastAsia="Calibri"/>
-        </w:rPr>
-        <w:t xml:space="preserve"> </w:t>
+      </w:r>
+      <w:r>
+        <w:rPr>
+          <w:rFonts w:ascii="Calibri" w:hAnsi="Calibri" w:cs="Calibri" w:eastAsia="Calibri"/>
+        </w:rPr>
+      </w:r>
+      <w:r>
+        <w:rPr>
+          <w:rFonts w:ascii="Calibri" w:hAnsi="Calibri" w:cs="Calibri" w:eastAsia="Calibri"/>
+        </w:rPr>
+      </w:r>
+      <w:r>
+        <w:rPr>
+          <w:rFonts w:ascii="Calibri" w:hAnsi="Calibri" w:cs="Calibri" w:eastAsia="Calibri"/>
+        </w:rPr>
       </w:r>
       <w:r>
         <w:rPr>
           <w:rFonts w:ascii="Calibri" w:hAnsi="Calibri" w:cs="Calibri" w:eastAsia="Calibri"/>
           <w:rStyle w:val="VerbatimChar"/>
         </w:rPr>
-        <w:t xml:space="preserve">yes</w:t>
-      </w:r>
-      <w:r>
-        <w:rPr>
-          <w:rFonts w:ascii="Calibri" w:hAnsi="Calibri" w:cs="Calibri" w:eastAsia="Calibri"/>
-        </w:rPr>
-        <w:t xml:space="preserve">/</w:t>
+      </w:r>
+      <w:r>
+        <w:rPr>
+          <w:rFonts w:ascii="Calibri" w:hAnsi="Calibri" w:cs="Calibri" w:eastAsia="Calibri"/>
+        </w:rPr>
       </w:r>
       <w:r>
         <w:rPr>
           <w:rFonts w:ascii="Calibri" w:hAnsi="Calibri" w:cs="Calibri" w:eastAsia="Calibri"/>
           <w:rStyle w:val="VerbatimChar"/>
         </w:rPr>
-        <w:t xml:space="preserve">no</w:t>
-      </w:r>
-      <w:r>
-        <w:rPr>
-          <w:rFonts w:ascii="Calibri" w:hAnsi="Calibri" w:cs="Calibri" w:eastAsia="Calibri"/>
-        </w:rPr>
-        <w:t xml:space="preserve">/blank/</w:t>
+      </w:r>
+      <w:r>
+        <w:rPr>
+          <w:rFonts w:ascii="Calibri" w:hAnsi="Calibri" w:cs="Calibri" w:eastAsia="Calibri"/>
+        </w:rPr>
       </w:r>
       <w:r>
         <w:rPr>
           <w:rFonts w:ascii="Calibri" w:hAnsi="Calibri" w:cs="Calibri" w:eastAsia="Calibri"/>
           <w:rStyle w:val="VerbatimChar"/>
         </w:rPr>
-        <w:t xml:space="preserve">NA</w:t>
-      </w:r>
-      <w:r>
-        <w:rPr>
-          <w:rFonts w:ascii="Calibri" w:hAnsi="Calibri" w:cs="Calibri" w:eastAsia="Calibri"/>
-        </w:rPr>
-        <w:t xml:space="preserve"> </w:t>
-      </w:r>
-      <w:r>
-        <w:rPr>
-          <w:rFonts w:ascii="Calibri" w:hAnsi="Calibri" w:cs="Calibri" w:eastAsia="Calibri"/>
-        </w:rPr>
-        <w:t xml:space="preserve">in every row (290</w:t>
-      </w:r>
-      <w:r>
-        <w:rPr>
-          <w:rFonts w:ascii="Calibri" w:hAnsi="Calibri" w:cs="Calibri" w:eastAsia="Calibri"/>
-        </w:rPr>
-        <w:t xml:space="preserve"> </w:t>
+      </w:r>
+      <w:r>
+        <w:rPr>
+          <w:rFonts w:ascii="Calibri" w:hAnsi="Calibri" w:cs="Calibri" w:eastAsia="Calibri"/>
+        </w:rPr>
+      </w:r>
+      <w:r>
+        <w:rPr>
+          <w:rFonts w:ascii="Calibri" w:hAnsi="Calibri" w:cs="Calibri" w:eastAsia="Calibri"/>
+        </w:rPr>
+      </w:r>
+      <w:r>
+        <w:rPr>
+          <w:rFonts w:ascii="Calibri" w:hAnsi="Calibri" w:cs="Calibri" w:eastAsia="Calibri"/>
+        </w:rPr>
       </w:r>
       <w:r>
         <w:rPr>
           <w:rFonts w:ascii="Calibri" w:hAnsi="Calibri" w:cs="Calibri" w:eastAsia="Calibri"/>
           <w:rStyle w:val="VerbatimChar"/>
         </w:rPr>
-        <w:t xml:space="preserve">yes</w:t>
-      </w:r>
-      <w:r>
-        <w:rPr>
-          <w:rFonts w:ascii="Calibri" w:hAnsi="Calibri" w:cs="Calibri" w:eastAsia="Calibri"/>
-        </w:rPr>
-        <w:t xml:space="preserve">, 94</w:t>
-      </w:r>
-      <w:r>
-        <w:rPr>
-          <w:rFonts w:ascii="Calibri" w:hAnsi="Calibri" w:cs="Calibri" w:eastAsia="Calibri"/>
-        </w:rPr>
-        <w:t xml:space="preserve"> </w:t>
+      </w:r>
+      <w:r>
+        <w:rPr>
+          <w:rFonts w:ascii="Calibri" w:hAnsi="Calibri" w:cs="Calibri" w:eastAsia="Calibri"/>
+        </w:rPr>
+      </w:r>
+      <w:r>
+        <w:rPr>
+          <w:rFonts w:ascii="Calibri" w:hAnsi="Calibri" w:cs="Calibri" w:eastAsia="Calibri"/>
+        </w:rPr>
       </w:r>
       <w:r>
         <w:rPr>
           <w:rFonts w:ascii="Calibri" w:hAnsi="Calibri" w:cs="Calibri" w:eastAsia="Calibri"/>
           <w:rStyle w:val="VerbatimChar"/>
         </w:rPr>
-        <w:t xml:space="preserve">no</w:t>
-      </w:r>
-      <w:r>
-        <w:rPr>
-          <w:rFonts w:ascii="Calibri" w:hAnsi="Calibri" w:cs="Calibri" w:eastAsia="Calibri"/>
-        </w:rPr>
-        <w:t xml:space="preserve">, 384</w:t>
-      </w:r>
-      <w:r>
-        <w:rPr>
-          <w:rFonts w:ascii="Calibri" w:hAnsi="Calibri" w:cs="Calibri" w:eastAsia="Calibri"/>
-        </w:rPr>
-        <w:t xml:space="preserve"> </w:t>
+      </w:r>
+      <w:r>
+        <w:rPr>
+          <w:rFonts w:ascii="Calibri" w:hAnsi="Calibri" w:cs="Calibri" w:eastAsia="Calibri"/>
+        </w:rPr>
+      </w:r>
+      <w:r>
+        <w:rPr>
+          <w:rFonts w:ascii="Calibri" w:hAnsi="Calibri" w:cs="Calibri" w:eastAsia="Calibri"/>
+        </w:rPr>
       </w:r>
       <w:r>
         <w:rPr>
           <w:rFonts w:ascii="Calibri" w:hAnsi="Calibri" w:cs="Calibri" w:eastAsia="Calibri"/>
           <w:rStyle w:val="VerbatimChar"/>
         </w:rPr>
-        <w:t xml:space="preserve">NA</w:t>
-      </w:r>
-      <w:r>
-        <w:rPr>
-          <w:rFonts w:ascii="Calibri" w:hAnsi="Calibri" w:cs="Calibri" w:eastAsia="Calibri"/>
-        </w:rPr>
-        <w:t xml:space="preserve">; perfect diagonal cross-tab), switching</w:t>
-      </w:r>
-      <w:r>
-        <w:rPr>
-          <w:rFonts w:ascii="Calibri" w:hAnsi="Calibri" w:cs="Calibri" w:eastAsia="Calibri"/>
-        </w:rPr>
-        <w:t xml:space="preserve"> </w:t>
-      </w:r>
-      <w:r>
-        <w:rPr>
-          <w:rFonts w:ascii="Calibri" w:hAnsi="Calibri" w:cs="Calibri" w:eastAsia="Calibri"/>
-        </w:rPr>
-        <w:t xml:space="preserve">to</w:t>
-      </w:r>
-      <w:r>
-        <w:rPr>
-          <w:rFonts w:ascii="Calibri" w:hAnsi="Calibri" w:cs="Calibri" w:eastAsia="Calibri"/>
-        </w:rPr>
-        <w:t xml:space="preserve"> </w:t>
+      </w:r>
+      <w:r>
+        <w:rPr>
+          <w:rFonts w:ascii="Calibri" w:hAnsi="Calibri" w:cs="Calibri" w:eastAsia="Calibri"/>
+        </w:rPr>
+      </w:r>
+      <w:r>
+        <w:rPr>
+          <w:rFonts w:ascii="Calibri" w:hAnsi="Calibri" w:cs="Calibri" w:eastAsia="Calibri"/>
+        </w:rPr>
+      </w:r>
+      <w:r>
+        <w:rPr>
+          <w:rFonts w:ascii="Calibri" w:hAnsi="Calibri" w:cs="Calibri" w:eastAsia="Calibri"/>
+        </w:rPr>
+      </w:r>
+      <w:r>
+        <w:rPr>
+          <w:rFonts w:ascii="Calibri" w:hAnsi="Calibri" w:cs="Calibri" w:eastAsia="Calibri"/>
+        </w:rPr>
       </w:r>
       <w:r>
         <w:rPr>
           <w:rFonts w:ascii="Calibri" w:hAnsi="Calibri" w:cs="Calibri" w:eastAsia="Calibri"/>
           <w:rStyle w:val="VerbatimChar"/>
         </w:rPr>
-        <w:t xml:space="preserve">yes</w:t>
-      </w:r>
-      <w:r>
-        <w:rPr>
-          <w:rFonts w:ascii="Calibri" w:hAnsi="Calibri" w:cs="Calibri" w:eastAsia="Calibri"/>
-        </w:rPr>
-        <w:t xml:space="preserve"> </w:t>
-      </w:r>
-      <w:r>
-        <w:rPr>
-          <w:rFonts w:ascii="Calibri" w:hAnsi="Calibri" w:cs="Calibri" w:eastAsia="Calibri"/>
-        </w:rPr>
-        <w:t xml:space="preserve">on the same visit for all 24 wounded corals.</w:t>
+      </w:r>
+      <w:r>
+        <w:rPr>
+          <w:rFonts w:ascii="Calibri" w:hAnsi="Calibri" w:cs="Calibri" w:eastAsia="Calibri"/>
+        </w:rPr>
+      </w:r>
+      <w:r>
+        <w:rPr>
+          <w:rFonts w:ascii="Calibri" w:hAnsi="Calibri" w:cs="Calibri" w:eastAsia="Calibri"/>
+        </w:rPr>
       </w:r>
     </w:p>
     <w:p>
@@ -2370,37 +2295,32 @@
           <w:b/>
           <w:bCs/>
         </w:rPr>
-        <w:t xml:space="preserve">This is not a data-entry error — it is how the trait was scored.</w:t>
-      </w:r>
-      <w:r>
-        <w:rPr>
-          <w:rFonts w:ascii="Calibri" w:hAnsi="Calibri" w:cs="Calibri" w:eastAsia="Calibri"/>
-        </w:rPr>
-        <w:t xml:space="preserve"> </w:t>
-      </w:r>
-      <w:r>
-        <w:rPr>
-          <w:rFonts w:ascii="Calibri" w:hAnsi="Calibri" w:cs="Calibri" w:eastAsia="Calibri"/>
-        </w:rPr>
-        <w:t xml:space="preserve">M.</w:t>
-      </w:r>
-      <w:r>
-        <w:rPr>
-          <w:rFonts w:ascii="Calibri" w:hAnsi="Calibri" w:cs="Calibri" w:eastAsia="Calibri"/>
-        </w:rPr>
-        <w:t xml:space="preserve"> </w:t>
-      </w:r>
-      <w:r>
-        <w:rPr>
-          <w:rFonts w:ascii="Calibri" w:hAnsi="Calibri" w:cs="Calibri" w:eastAsia="Calibri"/>
-        </w:rPr>
-        <w:t xml:space="preserve">Brzezinski (pers. comm., 2026) confirmed the central "hole"</w:t>
-      </w:r>
-      <w:r>
-        <w:rPr>
-          <w:rFonts w:ascii="Calibri" w:hAnsi="Calibri" w:cs="Calibri" w:eastAsia="Calibri"/>
-        </w:rPr>
-        <w:t xml:space="preserve"> </w:t>
+        <w:t>This is not a data-entry error — it is how the trait was scored. M. Brzezinski (pers. comm., 2026) confirmed the central "hole" is the axial polyp hole, which forms around the regenerating axial polyp, so the two go together (a hole without a polyp was rare; add the exact count before citing): a single observable. On Molly's recommendation, the two are combined and renamed axial_polyp_formation (the axial corallite/calyx + polyp structure).</w:t>
+      </w:r>
+      <w:r>
+        <w:rPr>
+          <w:rFonts w:ascii="Calibri" w:hAnsi="Calibri" w:cs="Calibri" w:eastAsia="Calibri"/>
+        </w:rPr>
+      </w:r>
+      <w:r>
+        <w:rPr>
+          <w:rFonts w:ascii="Calibri" w:hAnsi="Calibri" w:cs="Calibri" w:eastAsia="Calibri"/>
+        </w:rPr>
+      </w:r>
+      <w:r>
+        <w:rPr>
+          <w:rFonts w:ascii="Calibri" w:hAnsi="Calibri" w:cs="Calibri" w:eastAsia="Calibri"/>
+        </w:rPr>
+      </w:r>
+      <w:r>
+        <w:rPr>
+          <w:rFonts w:ascii="Calibri" w:hAnsi="Calibri" w:cs="Calibri" w:eastAsia="Calibri"/>
+        </w:rPr>
+      </w:r>
+      <w:r>
+        <w:rPr>
+          <w:rFonts w:ascii="Calibri" w:hAnsi="Calibri" w:cs="Calibri" w:eastAsia="Calibri"/>
+        </w:rPr>
       </w:r>
       <w:r>
         <w:rPr>
@@ -2408,61 +2328,51 @@
           <w:i/>
           <w:iCs/>
         </w:rPr>
-        <w:t xml:space="preserve">is</w:t>
-      </w:r>
-      <w:r>
-        <w:rPr>
-          <w:rFonts w:ascii="Calibri" w:hAnsi="Calibri" w:cs="Calibri" w:eastAsia="Calibri"/>
-        </w:rPr>
-        <w:t xml:space="preserve"> </w:t>
-      </w:r>
-      <w:r>
-        <w:rPr>
-          <w:rFonts w:ascii="Calibri" w:hAnsi="Calibri" w:cs="Calibri" w:eastAsia="Calibri"/>
-        </w:rPr>
-        <w:t xml:space="preserve">the axial polyp</w:t>
-      </w:r>
-      <w:r>
-        <w:rPr>
-          <w:rFonts w:ascii="Calibri" w:hAnsi="Calibri" w:cs="Calibri" w:eastAsia="Calibri"/>
-        </w:rPr>
-        <w:t xml:space="preserve"> </w:t>
-      </w:r>
-      <w:r>
-        <w:rPr>
-          <w:rFonts w:ascii="Calibri" w:hAnsi="Calibri" w:cs="Calibri" w:eastAsia="Calibri"/>
-        </w:rPr>
-        <w:t xml:space="preserve">hole, which forms around the regenerating axial polyp, so the two go together (a</w:t>
-      </w:r>
-      <w:r>
-        <w:rPr>
-          <w:rFonts w:ascii="Calibri" w:hAnsi="Calibri" w:cs="Calibri" w:eastAsia="Calibri"/>
-        </w:rPr>
-        <w:t xml:space="preserve"> </w:t>
-      </w:r>
-      <w:r>
-        <w:rPr>
-          <w:rFonts w:ascii="Calibri" w:hAnsi="Calibri" w:cs="Calibri" w:eastAsia="Calibri"/>
-        </w:rPr>
-        <w:t xml:space="preserve">hole without a polyp was seen only once or twice): a single observable. On Molly's</w:t>
-      </w:r>
-      <w:r>
-        <w:rPr>
-          <w:rFonts w:ascii="Calibri" w:hAnsi="Calibri" w:cs="Calibri" w:eastAsia="Calibri"/>
-        </w:rPr>
-        <w:t xml:space="preserve"> </w:t>
-      </w:r>
-      <w:r>
-        <w:rPr>
-          <w:rFonts w:ascii="Calibri" w:hAnsi="Calibri" w:cs="Calibri" w:eastAsia="Calibri"/>
-        </w:rPr>
-        <w:t xml:space="preserve">recommendation, the two are</w:t>
-      </w:r>
-      <w:r>
-        <w:rPr>
-          <w:rFonts w:ascii="Calibri" w:hAnsi="Calibri" w:cs="Calibri" w:eastAsia="Calibri"/>
-        </w:rPr>
-        <w:t xml:space="preserve"> </w:t>
+      </w:r>
+      <w:r>
+        <w:rPr>
+          <w:rFonts w:ascii="Calibri" w:hAnsi="Calibri" w:cs="Calibri" w:eastAsia="Calibri"/>
+        </w:rPr>
+      </w:r>
+      <w:r>
+        <w:rPr>
+          <w:rFonts w:ascii="Calibri" w:hAnsi="Calibri" w:cs="Calibri" w:eastAsia="Calibri"/>
+        </w:rPr>
+      </w:r>
+      <w:r>
+        <w:rPr>
+          <w:rFonts w:ascii="Calibri" w:hAnsi="Calibri" w:cs="Calibri" w:eastAsia="Calibri"/>
+        </w:rPr>
+      </w:r>
+      <w:r>
+        <w:rPr>
+          <w:rFonts w:ascii="Calibri" w:hAnsi="Calibri" w:cs="Calibri" w:eastAsia="Calibri"/>
+        </w:rPr>
+      </w:r>
+      <w:r>
+        <w:rPr>
+          <w:rFonts w:ascii="Calibri" w:hAnsi="Calibri" w:cs="Calibri" w:eastAsia="Calibri"/>
+        </w:rPr>
+      </w:r>
+      <w:r>
+        <w:rPr>
+          <w:rFonts w:ascii="Calibri" w:hAnsi="Calibri" w:cs="Calibri" w:eastAsia="Calibri"/>
+        </w:rPr>
+      </w:r>
+      <w:r>
+        <w:rPr>
+          <w:rFonts w:ascii="Calibri" w:hAnsi="Calibri" w:cs="Calibri" w:eastAsia="Calibri"/>
+        </w:rPr>
+      </w:r>
+      <w:r>
+        <w:rPr>
+          <w:rFonts w:ascii="Calibri" w:hAnsi="Calibri" w:cs="Calibri" w:eastAsia="Calibri"/>
+        </w:rPr>
+      </w:r>
+      <w:r>
+        <w:rPr>
+          <w:rFonts w:ascii="Calibri" w:hAnsi="Calibri" w:cs="Calibri" w:eastAsia="Calibri"/>
+        </w:rPr>
       </w:r>
       <w:r>
         <w:rPr>
@@ -2470,7 +2380,6 @@
           <w:b/>
           <w:bCs/>
         </w:rPr>
-        <w:t xml:space="preserve">combined and renamed</w:t>
       </w:r>
       <w:r>
         <w:rPr>
@@ -2478,7 +2387,6 @@
           <w:b/>
           <w:bCs/>
         </w:rPr>
-        <w:t xml:space="preserve"> </w:t>
       </w:r>
       <w:r>
         <w:rPr>
@@ -2487,31 +2395,26 @@
           <w:b/>
           <w:bCs/>
         </w:rPr>
-        <w:t xml:space="preserve">axial_polyp_formation</w:t>
-      </w:r>
-      <w:r>
-        <w:rPr>
-          <w:rFonts w:ascii="Calibri" w:hAnsi="Calibri" w:cs="Calibri" w:eastAsia="Calibri"/>
-        </w:rPr>
-        <w:t xml:space="preserve"> </w:t>
-      </w:r>
-      <w:r>
-        <w:rPr>
-          <w:rFonts w:ascii="Calibri" w:hAnsi="Calibri" w:cs="Calibri" w:eastAsia="Calibri"/>
-        </w:rPr>
-        <w:t xml:space="preserve">(the</w:t>
-      </w:r>
-      <w:r>
-        <w:rPr>
-          <w:rFonts w:ascii="Calibri" w:hAnsi="Calibri" w:cs="Calibri" w:eastAsia="Calibri"/>
-        </w:rPr>
-        <w:t xml:space="preserve"> </w:t>
-      </w:r>
-      <w:r>
-        <w:rPr>
-          <w:rFonts w:ascii="Calibri" w:hAnsi="Calibri" w:cs="Calibri" w:eastAsia="Calibri"/>
-        </w:rPr>
-        <w:t xml:space="preserve">axial corallite/calyx + polyp structure).</w:t>
+      </w:r>
+      <w:r>
+        <w:rPr>
+          <w:rFonts w:ascii="Calibri" w:hAnsi="Calibri" w:cs="Calibri" w:eastAsia="Calibri"/>
+        </w:rPr>
+      </w:r>
+      <w:r>
+        <w:rPr>
+          <w:rFonts w:ascii="Calibri" w:hAnsi="Calibri" w:cs="Calibri" w:eastAsia="Calibri"/>
+        </w:rPr>
+      </w:r>
+      <w:r>
+        <w:rPr>
+          <w:rFonts w:ascii="Calibri" w:hAnsi="Calibri" w:cs="Calibri" w:eastAsia="Calibri"/>
+        </w:rPr>
+      </w:r>
+      <w:r>
+        <w:rPr>
+          <w:rFonts w:ascii="Calibri" w:hAnsi="Calibri" w:cs="Calibri" w:eastAsia="Calibri"/>
+        </w:rPr>
       </w:r>
     </w:p>
     <w:p>
@@ -2697,13 +2600,12 @@
         <w:rPr>
           <w:rFonts w:ascii="Calibri" w:hAnsi="Calibri" w:cs="Calibri" w:eastAsia="Calibri"/>
         </w:rPr>
-        <w:t xml:space="preserve">Phase note: Table 1 of the manuscript places this trait in the</w:t>
-      </w:r>
-      <w:r>
-        <w:rPr>
-          <w:rFonts w:ascii="Calibri" w:hAnsi="Calibri" w:cs="Calibri" w:eastAsia="Calibri"/>
-        </w:rPr>
-        <w:t xml:space="preserve"> </w:t>
+        <w:t>Phase note: Table 1 of the manuscript places this trait in the tissue-healing phase. This fits the two-phase framework: tissue covers the wound first, then skeleton/corallites regrow, which scores regeneration at the branch tip via tip_exist / tip_extension / new_corallites_on_tip — even though the axial polyp hole is where the axial corallite eventually regenerates.</w:t>
+      </w:r>
+      <w:r>
+        <w:rPr>
+          <w:rFonts w:ascii="Calibri" w:hAnsi="Calibri" w:cs="Calibri" w:eastAsia="Calibri"/>
+        </w:rPr>
       </w:r>
       <w:r>
         <w:rPr>
@@ -2711,25 +2613,21 @@
           <w:b/>
           <w:bCs/>
         </w:rPr>
-        <w:t xml:space="preserve">tissue-healing</w:t>
-      </w:r>
-      <w:r>
-        <w:rPr>
-          <w:rFonts w:ascii="Calibri" w:hAnsi="Calibri" w:cs="Calibri" w:eastAsia="Calibri"/>
-        </w:rPr>
-        <w:t xml:space="preserve"> </w:t>
-      </w:r>
-      <w:r>
-        <w:rPr>
-          <w:rFonts w:ascii="Calibri" w:hAnsi="Calibri" w:cs="Calibri" w:eastAsia="Calibri"/>
-        </w:rPr>
-        <w:t xml:space="preserve">phase. This fits the biphasic framework, which scores</w:t>
-      </w:r>
-      <w:r>
-        <w:rPr>
-          <w:rFonts w:ascii="Calibri" w:hAnsi="Calibri" w:cs="Calibri" w:eastAsia="Calibri"/>
-        </w:rPr>
-        <w:t xml:space="preserve"> </w:t>
+      </w:r>
+      <w:r>
+        <w:rPr>
+          <w:rFonts w:ascii="Calibri" w:hAnsi="Calibri" w:cs="Calibri" w:eastAsia="Calibri"/>
+        </w:rPr>
+      </w:r>
+      <w:r>
+        <w:rPr>
+          <w:rFonts w:ascii="Calibri" w:hAnsi="Calibri" w:cs="Calibri" w:eastAsia="Calibri"/>
+        </w:rPr>
+      </w:r>
+      <w:r>
+        <w:rPr>
+          <w:rFonts w:ascii="Calibri" w:hAnsi="Calibri" w:cs="Calibri" w:eastAsia="Calibri"/>
+        </w:rPr>
       </w:r>
       <w:r>
         <w:rPr>
@@ -2737,106 +2635,89 @@
           <w:i/>
           <w:iCs/>
         </w:rPr>
-        <w:t xml:space="preserve">regeneration</w:t>
-      </w:r>
-      <w:r>
-        <w:rPr>
-          <w:rFonts w:ascii="Calibri" w:hAnsi="Calibri" w:cs="Calibri" w:eastAsia="Calibri"/>
-        </w:rPr>
-        <w:t xml:space="preserve"> </w:t>
-      </w:r>
-      <w:r>
-        <w:rPr>
-          <w:rFonts w:ascii="Calibri" w:hAnsi="Calibri" w:cs="Calibri" w:eastAsia="Calibri"/>
-        </w:rPr>
-        <w:t xml:space="preserve">at the branch tip via</w:t>
-      </w:r>
-      <w:r>
-        <w:rPr>
-          <w:rFonts w:ascii="Calibri" w:hAnsi="Calibri" w:cs="Calibri" w:eastAsia="Calibri"/>
-        </w:rPr>
-        <w:t xml:space="preserve"> </w:t>
+      </w:r>
+      <w:r>
+        <w:rPr>
+          <w:rFonts w:ascii="Calibri" w:hAnsi="Calibri" w:cs="Calibri" w:eastAsia="Calibri"/>
+        </w:rPr>
+      </w:r>
+      <w:r>
+        <w:rPr>
+          <w:rFonts w:ascii="Calibri" w:hAnsi="Calibri" w:cs="Calibri" w:eastAsia="Calibri"/>
+        </w:rPr>
+      </w:r>
+      <w:r>
+        <w:rPr>
+          <w:rFonts w:ascii="Calibri" w:hAnsi="Calibri" w:cs="Calibri" w:eastAsia="Calibri"/>
+        </w:rPr>
       </w:r>
       <w:r>
         <w:rPr>
           <w:rFonts w:ascii="Calibri" w:hAnsi="Calibri" w:cs="Calibri" w:eastAsia="Calibri"/>
           <w:rStyle w:val="VerbatimChar"/>
         </w:rPr>
-        <w:t xml:space="preserve">tip_exist</w:t>
-      </w:r>
-      <w:r>
-        <w:rPr>
-          <w:rFonts w:ascii="Calibri" w:hAnsi="Calibri" w:cs="Calibri" w:eastAsia="Calibri"/>
-        </w:rPr>
-        <w:t xml:space="preserve"> </w:t>
-      </w:r>
-      <w:r>
-        <w:rPr>
-          <w:rFonts w:ascii="Calibri" w:hAnsi="Calibri" w:cs="Calibri" w:eastAsia="Calibri"/>
-        </w:rPr>
-        <w:t xml:space="preserve">/</w:t>
-      </w:r>
-      <w:r>
-        <w:rPr>
-          <w:rFonts w:ascii="Calibri" w:hAnsi="Calibri" w:cs="Calibri" w:eastAsia="Calibri"/>
-        </w:rPr>
-        <w:t xml:space="preserve"> </w:t>
+      </w:r>
+      <w:r>
+        <w:rPr>
+          <w:rFonts w:ascii="Calibri" w:hAnsi="Calibri" w:cs="Calibri" w:eastAsia="Calibri"/>
+        </w:rPr>
+      </w:r>
+      <w:r>
+        <w:rPr>
+          <w:rFonts w:ascii="Calibri" w:hAnsi="Calibri" w:cs="Calibri" w:eastAsia="Calibri"/>
+        </w:rPr>
+      </w:r>
+      <w:r>
+        <w:rPr>
+          <w:rFonts w:ascii="Calibri" w:hAnsi="Calibri" w:cs="Calibri" w:eastAsia="Calibri"/>
+        </w:rPr>
       </w:r>
       <w:r>
         <w:rPr>
           <w:rFonts w:ascii="Calibri" w:hAnsi="Calibri" w:cs="Calibri" w:eastAsia="Calibri"/>
           <w:rStyle w:val="VerbatimChar"/>
         </w:rPr>
-        <w:t xml:space="preserve">tip_extension</w:t>
-      </w:r>
-      <w:r>
-        <w:rPr>
-          <w:rFonts w:ascii="Calibri" w:hAnsi="Calibri" w:cs="Calibri" w:eastAsia="Calibri"/>
-        </w:rPr>
-        <w:t xml:space="preserve"> </w:t>
-      </w:r>
-      <w:r>
-        <w:rPr>
-          <w:rFonts w:ascii="Calibri" w:hAnsi="Calibri" w:cs="Calibri" w:eastAsia="Calibri"/>
-        </w:rPr>
-        <w:t xml:space="preserve">/</w:t>
-      </w:r>
-      <w:r>
-        <w:rPr>
-          <w:rFonts w:ascii="Calibri" w:hAnsi="Calibri" w:cs="Calibri" w:eastAsia="Calibri"/>
-        </w:rPr>
-        <w:t xml:space="preserve"> </w:t>
+      </w:r>
+      <w:r>
+        <w:rPr>
+          <w:rFonts w:ascii="Calibri" w:hAnsi="Calibri" w:cs="Calibri" w:eastAsia="Calibri"/>
+        </w:rPr>
+      </w:r>
+      <w:r>
+        <w:rPr>
+          <w:rFonts w:ascii="Calibri" w:hAnsi="Calibri" w:cs="Calibri" w:eastAsia="Calibri"/>
+        </w:rPr>
+      </w:r>
+      <w:r>
+        <w:rPr>
+          <w:rFonts w:ascii="Calibri" w:hAnsi="Calibri" w:cs="Calibri" w:eastAsia="Calibri"/>
+        </w:rPr>
       </w:r>
       <w:r>
         <w:rPr>
           <w:rFonts w:ascii="Calibri" w:hAnsi="Calibri" w:cs="Calibri" w:eastAsia="Calibri"/>
           <w:rStyle w:val="VerbatimChar"/>
         </w:rPr>
-        <w:t xml:space="preserve">new_corallites_on_tip</w:t>
-      </w:r>
-      <w:r>
-        <w:rPr>
-          <w:rFonts w:ascii="Calibri" w:hAnsi="Calibri" w:cs="Calibri" w:eastAsia="Calibri"/>
-        </w:rPr>
-        <w:t xml:space="preserve"> </w:t>
-      </w:r>
-      <w:r>
-        <w:rPr>
-          <w:rFonts w:ascii="Calibri" w:hAnsi="Calibri" w:cs="Calibri" w:eastAsia="Calibri"/>
-        </w:rPr>
-        <w:t xml:space="preserve">— even though the axial polyp hole is where the axial</w:t>
-      </w:r>
-      <w:r>
-        <w:rPr>
-          <w:rFonts w:ascii="Calibri" w:hAnsi="Calibri" w:cs="Calibri" w:eastAsia="Calibri"/>
-        </w:rPr>
-        <w:t xml:space="preserve"> </w:t>
-      </w:r>
-      <w:r>
-        <w:rPr>
-          <w:rFonts w:ascii="Calibri" w:hAnsi="Calibri" w:cs="Calibri" w:eastAsia="Calibri"/>
-        </w:rPr>
-        <w:t xml:space="preserve">corallite eventually regenerates.</w:t>
+      </w:r>
+      <w:r>
+        <w:rPr>
+          <w:rFonts w:ascii="Calibri" w:hAnsi="Calibri" w:cs="Calibri" w:eastAsia="Calibri"/>
+        </w:rPr>
+      </w:r>
+      <w:r>
+        <w:rPr>
+          <w:rFonts w:ascii="Calibri" w:hAnsi="Calibri" w:cs="Calibri" w:eastAsia="Calibri"/>
+        </w:rPr>
+      </w:r>
+      <w:r>
+        <w:rPr>
+          <w:rFonts w:ascii="Calibri" w:hAnsi="Calibri" w:cs="Calibri" w:eastAsia="Calibri"/>
+        </w:rPr>
+      </w:r>
+      <w:r>
+        <w:rPr>
+          <w:rFonts w:ascii="Calibri" w:hAnsi="Calibri" w:cs="Calibri" w:eastAsia="Calibri"/>
+        </w:rPr>
       </w:r>
     </w:p>
     <w:bookmarkEnd w:id="11"/>

</xml_diff>